<commit_message>
Automation - 10/15/2026 part 6
</commit_message>
<xml_diff>
--- a/6-Automation/Python/14-PDF Studio - Ver 1.0 - id 20/Documentation/PDF Studio - Code Source.docx
+++ b/6-Automation/Python/14-PDF Studio - Ver 1.0 - id 20/Documentation/PDF Studio - Code Source.docx
@@ -85,25 +85,7 @@
           <w:sz w:val="18"/>
           <w:highlight w:val="lightGray"/>
         </w:rPr>
-        <w:t xml:space="preserve"> -&gt; ID Column: 1, </w:t>
-      </w:r>
-      <w:proofErr w:type="spellStart"/>
-      <w:r>
-        <w:rPr>
-          <w:rFonts w:ascii="Arial" w:eastAsia="Arial" w:hAnsi="Arial"/>
-          <w:sz w:val="18"/>
-          <w:highlight w:val="lightGray"/>
-        </w:rPr>
-        <w:t>Name_En</w:t>
-      </w:r>
-      <w:proofErr w:type="spellEnd"/>
-      <w:r>
-        <w:rPr>
-          <w:rFonts w:ascii="Arial" w:eastAsia="Arial" w:hAnsi="Arial"/>
-          <w:sz w:val="18"/>
-          <w:highlight w:val="lightGray"/>
-        </w:rPr>
-        <w:t xml:space="preserve"> Column: Motasem Essam] </w:t>
+        <w:t xml:space="preserve"> -&gt; ID Column: 1, Name_En Column: Motasem Essam] </w:t>
       </w:r>
       <w:r>
         <w:rPr>
@@ -141,9 +123,16 @@
           <w:szCs w:val="18"/>
           <w:highlight w:val="lightGray"/>
         </w:rPr>
-        <w:t xml:space="preserve">, </w:t>
-      </w:r>
-      <w:proofErr w:type="spellStart"/>
+        <w:t xml:space="preserve">, Name_En Column: </w:t>
+      </w:r>
+      <w:r>
+        <w:rPr>
+          <w:rFonts w:ascii="Arial" w:eastAsia="Arial" w:hAnsi="Arial"/>
+          <w:sz w:val="18"/>
+          <w:highlight w:val="lightGray"/>
+        </w:rPr>
+        <w:t>Motasem Essam</w:t>
+      </w:r>
       <w:r>
         <w:rPr>
           <w:rFonts w:ascii="Arial" w:eastAsia="Arial" w:hAnsi="Arial"/>
@@ -151,9 +140,8 @@
           <w:szCs w:val="18"/>
           <w:highlight w:val="lightGray"/>
         </w:rPr>
-        <w:t>Name_En</w:t>
-      </w:r>
-      <w:proofErr w:type="spellEnd"/>
+        <w:t>]</w:t>
+      </w:r>
       <w:r>
         <w:rPr>
           <w:rFonts w:ascii="Arial" w:eastAsia="Arial" w:hAnsi="Arial"/>
@@ -161,32 +149,6 @@
           <w:szCs w:val="18"/>
           <w:highlight w:val="lightGray"/>
         </w:rPr>
-        <w:t xml:space="preserve"> Column: </w:t>
-      </w:r>
-      <w:r>
-        <w:rPr>
-          <w:rFonts w:ascii="Arial" w:eastAsia="Arial" w:hAnsi="Arial"/>
-          <w:sz w:val="18"/>
-          <w:highlight w:val="lightGray"/>
-        </w:rPr>
-        <w:t>Motasem Essam</w:t>
-      </w:r>
-      <w:r>
-        <w:rPr>
-          <w:rFonts w:ascii="Arial" w:eastAsia="Arial" w:hAnsi="Arial"/>
-          <w:sz w:val="18"/>
-          <w:szCs w:val="18"/>
-          <w:highlight w:val="lightGray"/>
-        </w:rPr>
-        <w:t>]</w:t>
-      </w:r>
-      <w:r>
-        <w:rPr>
-          <w:rFonts w:ascii="Arial" w:eastAsia="Arial" w:hAnsi="Arial"/>
-          <w:sz w:val="18"/>
-          <w:szCs w:val="18"/>
-          <w:highlight w:val="lightGray"/>
-        </w:rPr>
         <w:t xml:space="preserve"> </w:t>
       </w:r>
       <w:r>
@@ -697,16 +659,8 @@
         <w:rPr>
           <w:rFonts w:ascii="Roboto Mono" w:hAnsi="Roboto Mono"/>
         </w:rPr>
-        <w:t xml:space="preserve">make merge has two </w:t>
-      </w:r>
-      <w:proofErr w:type="gramStart"/>
-      <w:r>
-        <w:rPr>
-          <w:rFonts w:ascii="Roboto Mono" w:hAnsi="Roboto Mono"/>
-        </w:rPr>
-        <w:t>option</w:t>
-      </w:r>
-      <w:proofErr w:type="gramEnd"/>
+        <w:t>make merge has two option</w:t>
+      </w:r>
     </w:p>
     <w:p>
       <w:pPr>
@@ -721,19 +675,11 @@
         </w:rPr>
         <w:t xml:space="preserve">* </w:t>
       </w:r>
-      <w:proofErr w:type="gramStart"/>
-      <w:r>
-        <w:rPr>
-          <w:rFonts w:ascii="Roboto Mono" w:hAnsi="Roboto Mono"/>
-        </w:rPr>
-        <w:t>merges</w:t>
-      </w:r>
-      <w:proofErr w:type="gramEnd"/>
-      <w:r>
-        <w:rPr>
-          <w:rFonts w:ascii="Roboto Mono" w:hAnsi="Roboto Mono"/>
-        </w:rPr>
-        <w:t xml:space="preserve"> pdf </w:t>
+      <w:r>
+        <w:rPr>
+          <w:rFonts w:ascii="Roboto Mono" w:hAnsi="Roboto Mono"/>
+        </w:rPr>
+        <w:t xml:space="preserve">merges pdf </w:t>
       </w:r>
     </w:p>
     <w:p>
@@ -750,19 +696,11 @@
         <w:lastRenderedPageBreak/>
         <w:t xml:space="preserve">* </w:t>
       </w:r>
-      <w:proofErr w:type="gramStart"/>
-      <w:r>
-        <w:rPr>
-          <w:rFonts w:ascii="Roboto Mono" w:hAnsi="Roboto Mono"/>
-        </w:rPr>
-        <w:t>or</w:t>
-      </w:r>
-      <w:proofErr w:type="gramEnd"/>
-      <w:r>
-        <w:rPr>
-          <w:rFonts w:ascii="Roboto Mono" w:hAnsi="Roboto Mono"/>
-        </w:rPr>
-        <w:t xml:space="preserve"> images</w:t>
+      <w:r>
+        <w:rPr>
+          <w:rFonts w:ascii="Roboto Mono" w:hAnsi="Roboto Mono"/>
+        </w:rPr>
+        <w:t>or images</w:t>
       </w:r>
     </w:p>
     <w:p>
@@ -788,6 +726,31 @@
           <w:rFonts w:ascii="Roboto Mono" w:hAnsi="Roboto Mono"/>
         </w:rPr>
         <w:t xml:space="preserve"> size</w:t>
+      </w:r>
+    </w:p>
+    <w:p>
+      <w:pPr>
+        <w:rPr>
+          <w:rFonts w:ascii="Roboto Mono" w:hAnsi="Roboto Mono"/>
+        </w:rPr>
+      </w:pPr>
+      <w:r>
+        <w:rPr>
+          <w:rFonts w:ascii="Roboto Mono" w:hAnsi="Roboto Mono"/>
+        </w:rPr>
+        <w:t xml:space="preserve">- </w:t>
+      </w:r>
+      <w:r>
+        <w:rPr>
+          <w:rFonts w:ascii="Roboto Mono" w:hAnsi="Roboto Mono"/>
+        </w:rPr>
+        <w:t xml:space="preserve">Add recent </w:t>
+      </w:r>
+      <w:r>
+        <w:rPr>
+          <w:rFonts w:ascii="Roboto Mono" w:hAnsi="Roboto Mono"/>
+        </w:rPr>
+        <w:t>pdfs</w:t>
       </w:r>
     </w:p>
     <w:p>
@@ -862,27 +825,7 @@
           <w:sz w:val="18"/>
           <w:highlight w:val="lightGray"/>
         </w:rPr>
-        <w:t xml:space="preserve">: Persons Table -&gt; ID Column: 1, </w:t>
-      </w:r>
-      <w:proofErr w:type="spellStart"/>
-      <w:r>
-        <w:rPr>
-          <w:rFonts w:ascii="Arial" w:eastAsia="Arial" w:hAnsi="Arial" w:cs="Arial"/>
-          <w:color w:val="000000"/>
-          <w:sz w:val="18"/>
-          <w:highlight w:val="lightGray"/>
-        </w:rPr>
-        <w:t>Name_En</w:t>
-      </w:r>
-      <w:proofErr w:type="spellEnd"/>
-      <w:r>
-        <w:rPr>
-          <w:rFonts w:ascii="Arial" w:eastAsia="Arial" w:hAnsi="Arial" w:cs="Arial"/>
-          <w:color w:val="000000"/>
-          <w:sz w:val="18"/>
-          <w:highlight w:val="lightGray"/>
-        </w:rPr>
-        <w:t xml:space="preserve"> Column: Motasem Essam] -&gt; </w:t>
+        <w:t xml:space="preserve">: Persons Table -&gt; ID Column: 1, Name_En Column: Motasem Essam] -&gt; </w:t>
       </w:r>
       <w:r>
         <w:rPr>
@@ -1615,6 +1558,119 @@
     </w:lvl>
   </w:abstractNum>
   <w:abstractNum w:abstractNumId="3" w15:restartNumberingAfterBreak="0">
+    <w:nsid w:val="262D41EB"/>
+    <w:multiLevelType w:val="hybridMultilevel"/>
+    <w:tmpl w:val="D494A8FA"/>
+    <w:lvl w:ilvl="0" w:tplc="38D4816E">
+      <w:start w:val="2"/>
+      <w:numFmt w:val="bullet"/>
+      <w:lvlText w:val="-"/>
+      <w:lvlJc w:val="left"/>
+      <w:pPr>
+        <w:ind w:left="720" w:hanging="360"/>
+      </w:pPr>
+      <w:rPr>
+        <w:rFonts w:ascii="Calibri" w:eastAsiaTheme="minorHAnsi" w:hAnsi="Calibri" w:cs="Calibri" w:hint="default"/>
+      </w:rPr>
+    </w:lvl>
+    <w:lvl w:ilvl="1" w:tplc="04090003">
+      <w:start w:val="1"/>
+      <w:numFmt w:val="bullet"/>
+      <w:lvlText w:val="o"/>
+      <w:lvlJc w:val="left"/>
+      <w:pPr>
+        <w:ind w:left="1440" w:hanging="360"/>
+      </w:pPr>
+      <w:rPr>
+        <w:rFonts w:ascii="Courier New" w:hAnsi="Courier New" w:cs="Courier New" w:hint="default"/>
+      </w:rPr>
+    </w:lvl>
+    <w:lvl w:ilvl="2" w:tplc="04090005" w:tentative="1">
+      <w:start w:val="1"/>
+      <w:numFmt w:val="bullet"/>
+      <w:lvlText w:val=""/>
+      <w:lvlJc w:val="left"/>
+      <w:pPr>
+        <w:ind w:left="2160" w:hanging="360"/>
+      </w:pPr>
+      <w:rPr>
+        <w:rFonts w:ascii="Wingdings" w:hAnsi="Wingdings" w:hint="default"/>
+      </w:rPr>
+    </w:lvl>
+    <w:lvl w:ilvl="3" w:tplc="04090001" w:tentative="1">
+      <w:start w:val="1"/>
+      <w:numFmt w:val="bullet"/>
+      <w:lvlText w:val=""/>
+      <w:lvlJc w:val="left"/>
+      <w:pPr>
+        <w:ind w:left="2880" w:hanging="360"/>
+      </w:pPr>
+      <w:rPr>
+        <w:rFonts w:ascii="Symbol" w:hAnsi="Symbol" w:hint="default"/>
+      </w:rPr>
+    </w:lvl>
+    <w:lvl w:ilvl="4" w:tplc="04090003" w:tentative="1">
+      <w:start w:val="1"/>
+      <w:numFmt w:val="bullet"/>
+      <w:lvlText w:val="o"/>
+      <w:lvlJc w:val="left"/>
+      <w:pPr>
+        <w:ind w:left="3600" w:hanging="360"/>
+      </w:pPr>
+      <w:rPr>
+        <w:rFonts w:ascii="Courier New" w:hAnsi="Courier New" w:cs="Courier New" w:hint="default"/>
+      </w:rPr>
+    </w:lvl>
+    <w:lvl w:ilvl="5" w:tplc="04090005" w:tentative="1">
+      <w:start w:val="1"/>
+      <w:numFmt w:val="bullet"/>
+      <w:lvlText w:val=""/>
+      <w:lvlJc w:val="left"/>
+      <w:pPr>
+        <w:ind w:left="4320" w:hanging="360"/>
+      </w:pPr>
+      <w:rPr>
+        <w:rFonts w:ascii="Wingdings" w:hAnsi="Wingdings" w:hint="default"/>
+      </w:rPr>
+    </w:lvl>
+    <w:lvl w:ilvl="6" w:tplc="04090001" w:tentative="1">
+      <w:start w:val="1"/>
+      <w:numFmt w:val="bullet"/>
+      <w:lvlText w:val=""/>
+      <w:lvlJc w:val="left"/>
+      <w:pPr>
+        <w:ind w:left="5040" w:hanging="360"/>
+      </w:pPr>
+      <w:rPr>
+        <w:rFonts w:ascii="Symbol" w:hAnsi="Symbol" w:hint="default"/>
+      </w:rPr>
+    </w:lvl>
+    <w:lvl w:ilvl="7" w:tplc="04090003" w:tentative="1">
+      <w:start w:val="1"/>
+      <w:numFmt w:val="bullet"/>
+      <w:lvlText w:val="o"/>
+      <w:lvlJc w:val="left"/>
+      <w:pPr>
+        <w:ind w:left="5760" w:hanging="360"/>
+      </w:pPr>
+      <w:rPr>
+        <w:rFonts w:ascii="Courier New" w:hAnsi="Courier New" w:cs="Courier New" w:hint="default"/>
+      </w:rPr>
+    </w:lvl>
+    <w:lvl w:ilvl="8" w:tplc="04090005" w:tentative="1">
+      <w:start w:val="1"/>
+      <w:numFmt w:val="bullet"/>
+      <w:lvlText w:val=""/>
+      <w:lvlJc w:val="left"/>
+      <w:pPr>
+        <w:ind w:left="6480" w:hanging="360"/>
+      </w:pPr>
+      <w:rPr>
+        <w:rFonts w:ascii="Wingdings" w:hAnsi="Wingdings" w:hint="default"/>
+      </w:rPr>
+    </w:lvl>
+  </w:abstractNum>
+  <w:abstractNum w:abstractNumId="4" w15:restartNumberingAfterBreak="0">
     <w:nsid w:val="387B7C3C"/>
     <w:multiLevelType w:val="multilevel"/>
     <w:tmpl w:val="C4F4391A"/>
@@ -1763,7 +1819,7 @@
       </w:rPr>
     </w:lvl>
   </w:abstractNum>
-  <w:abstractNum w:abstractNumId="4" w15:restartNumberingAfterBreak="0">
+  <w:abstractNum w:abstractNumId="5" w15:restartNumberingAfterBreak="0">
     <w:nsid w:val="39BC1B2D"/>
     <w:multiLevelType w:val="multilevel"/>
     <w:tmpl w:val="6CE05DB4"/>
@@ -1876,7 +1932,7 @@
       </w:pPr>
     </w:lvl>
   </w:abstractNum>
-  <w:abstractNum w:abstractNumId="5" w15:restartNumberingAfterBreak="0">
+  <w:abstractNum w:abstractNumId="6" w15:restartNumberingAfterBreak="0">
     <w:nsid w:val="4B007C43"/>
     <w:multiLevelType w:val="hybridMultilevel"/>
     <w:tmpl w:val="B9B85662"/>
@@ -1988,7 +2044,7 @@
       </w:rPr>
     </w:lvl>
   </w:abstractNum>
-  <w:abstractNum w:abstractNumId="6" w15:restartNumberingAfterBreak="0">
+  <w:abstractNum w:abstractNumId="7" w15:restartNumberingAfterBreak="0">
     <w:nsid w:val="4B0967C7"/>
     <w:multiLevelType w:val="multilevel"/>
     <w:tmpl w:val="34D63EF2"/>
@@ -2137,7 +2193,7 @@
       </w:rPr>
     </w:lvl>
   </w:abstractNum>
-  <w:abstractNum w:abstractNumId="7" w15:restartNumberingAfterBreak="0">
+  <w:abstractNum w:abstractNumId="8" w15:restartNumberingAfterBreak="0">
     <w:nsid w:val="4D1263F1"/>
     <w:multiLevelType w:val="hybridMultilevel"/>
     <w:tmpl w:val="A47EDFAE"/>
@@ -2250,7 +2306,7 @@
       </w:rPr>
     </w:lvl>
   </w:abstractNum>
-  <w:abstractNum w:abstractNumId="8" w15:restartNumberingAfterBreak="0">
+  <w:abstractNum w:abstractNumId="9" w15:restartNumberingAfterBreak="0">
     <w:nsid w:val="51D8232F"/>
     <w:multiLevelType w:val="hybridMultilevel"/>
     <w:tmpl w:val="FF16761E"/>
@@ -2362,7 +2418,7 @@
       </w:rPr>
     </w:lvl>
   </w:abstractNum>
-  <w:abstractNum w:abstractNumId="9" w15:restartNumberingAfterBreak="0">
+  <w:abstractNum w:abstractNumId="10" w15:restartNumberingAfterBreak="0">
     <w:nsid w:val="58696D3D"/>
     <w:multiLevelType w:val="multilevel"/>
     <w:tmpl w:val="0F4E9A84"/>
@@ -2511,7 +2567,7 @@
       </w:rPr>
     </w:lvl>
   </w:abstractNum>
-  <w:abstractNum w:abstractNumId="10" w15:restartNumberingAfterBreak="0">
+  <w:abstractNum w:abstractNumId="11" w15:restartNumberingAfterBreak="0">
     <w:nsid w:val="590848D1"/>
     <w:multiLevelType w:val="multilevel"/>
     <w:tmpl w:val="77D483EE"/>
@@ -2660,7 +2716,7 @@
       </w:rPr>
     </w:lvl>
   </w:abstractNum>
-  <w:abstractNum w:abstractNumId="11" w15:restartNumberingAfterBreak="0">
+  <w:abstractNum w:abstractNumId="12" w15:restartNumberingAfterBreak="0">
     <w:nsid w:val="5F3D74ED"/>
     <w:multiLevelType w:val="multilevel"/>
     <w:tmpl w:val="E5103712"/>
@@ -2773,7 +2829,7 @@
       </w:pPr>
     </w:lvl>
   </w:abstractNum>
-  <w:abstractNum w:abstractNumId="12" w15:restartNumberingAfterBreak="0">
+  <w:abstractNum w:abstractNumId="13" w15:restartNumberingAfterBreak="0">
     <w:nsid w:val="6BC94291"/>
     <w:multiLevelType w:val="multilevel"/>
     <w:tmpl w:val="EB20D6A8"/>
@@ -2890,7 +2946,7 @@
       </w:pPr>
     </w:lvl>
   </w:abstractNum>
-  <w:abstractNum w:abstractNumId="13" w15:restartNumberingAfterBreak="0">
+  <w:abstractNum w:abstractNumId="14" w15:restartNumberingAfterBreak="0">
     <w:nsid w:val="6D103B98"/>
     <w:multiLevelType w:val="multilevel"/>
     <w:tmpl w:val="D5D607F0"/>
@@ -3039,7 +3095,7 @@
       </w:rPr>
     </w:lvl>
   </w:abstractNum>
-  <w:abstractNum w:abstractNumId="14" w15:restartNumberingAfterBreak="0">
+  <w:abstractNum w:abstractNumId="15" w15:restartNumberingAfterBreak="0">
     <w:nsid w:val="6EDC33AC"/>
     <w:multiLevelType w:val="multilevel"/>
     <w:tmpl w:val="3AD8DA44"/>
@@ -3189,49 +3245,52 @@
     </w:lvl>
   </w:abstractNum>
   <w:num w:numId="1" w16cid:durableId="2085445645">
+    <w:abstractNumId w:val="14"/>
+  </w:num>
+  <w:num w:numId="2" w16cid:durableId="2027518451">
+    <w:abstractNumId w:val="4"/>
+  </w:num>
+  <w:num w:numId="3" w16cid:durableId="423115615">
+    <w:abstractNumId w:val="12"/>
+  </w:num>
+  <w:num w:numId="4" w16cid:durableId="901715199">
     <w:abstractNumId w:val="13"/>
   </w:num>
-  <w:num w:numId="2" w16cid:durableId="2027518451">
-    <w:abstractNumId w:val="3"/>
-  </w:num>
-  <w:num w:numId="3" w16cid:durableId="423115615">
-    <w:abstractNumId w:val="11"/>
-  </w:num>
-  <w:num w:numId="4" w16cid:durableId="901715199">
-    <w:abstractNumId w:val="12"/>
-  </w:num>
   <w:num w:numId="5" w16cid:durableId="407457864">
-    <w:abstractNumId w:val="4"/>
+    <w:abstractNumId w:val="5"/>
   </w:num>
   <w:num w:numId="6" w16cid:durableId="430205004">
     <w:abstractNumId w:val="0"/>
   </w:num>
   <w:num w:numId="7" w16cid:durableId="276258825">
-    <w:abstractNumId w:val="8"/>
+    <w:abstractNumId w:val="9"/>
   </w:num>
   <w:num w:numId="8" w16cid:durableId="1861242757">
-    <w:abstractNumId w:val="5"/>
+    <w:abstractNumId w:val="6"/>
   </w:num>
   <w:num w:numId="9" w16cid:durableId="384565573">
-    <w:abstractNumId w:val="6"/>
+    <w:abstractNumId w:val="7"/>
   </w:num>
   <w:num w:numId="10" w16cid:durableId="227887739">
-    <w:abstractNumId w:val="14"/>
+    <w:abstractNumId w:val="15"/>
   </w:num>
   <w:num w:numId="11" w16cid:durableId="467170550">
     <w:abstractNumId w:val="2"/>
   </w:num>
   <w:num w:numId="12" w16cid:durableId="1817650265">
-    <w:abstractNumId w:val="10"/>
+    <w:abstractNumId w:val="11"/>
   </w:num>
   <w:num w:numId="13" w16cid:durableId="182286663">
     <w:abstractNumId w:val="1"/>
   </w:num>
   <w:num w:numId="14" w16cid:durableId="870995127">
-    <w:abstractNumId w:val="9"/>
+    <w:abstractNumId w:val="10"/>
   </w:num>
   <w:num w:numId="15" w16cid:durableId="1504708409">
-    <w:abstractNumId w:val="7"/>
+    <w:abstractNumId w:val="8"/>
+  </w:num>
+  <w:num w:numId="16" w16cid:durableId="36205389">
+    <w:abstractNumId w:val="3"/>
   </w:num>
 </w:numbering>
 </file>

</xml_diff>

<commit_message>
Automation - 10/15/2026 part 7
</commit_message>
<xml_diff>
--- a/6-Automation/Python/14-PDF Studio - Ver 1.0 - id 20/Documentation/PDF Studio - Code Source.docx
+++ b/6-Automation/Python/14-PDF Studio - Ver 1.0 - id 20/Documentation/PDF Studio - Code Source.docx
@@ -751,6 +751,43 @@
           <w:rFonts w:ascii="Roboto Mono" w:hAnsi="Roboto Mono"/>
         </w:rPr>
         <w:t>pdfs</w:t>
+      </w:r>
+    </w:p>
+    <w:p>
+      <w:pPr>
+        <w:rPr>
+          <w:rFonts w:ascii="Roboto Mono" w:hAnsi="Roboto Mono"/>
+        </w:rPr>
+      </w:pPr>
+      <w:r>
+        <w:rPr>
+          <w:rFonts w:ascii="Roboto Mono" w:hAnsi="Roboto Mono"/>
+        </w:rPr>
+        <w:t xml:space="preserve">- </w:t>
+      </w:r>
+      <w:r>
+        <w:rPr>
+          <w:rFonts w:ascii="Roboto Mono" w:hAnsi="Roboto Mono"/>
+        </w:rPr>
+        <w:t xml:space="preserve">make me can </w:t>
+      </w:r>
+      <w:r>
+        <w:rPr>
+          <w:rFonts w:ascii="Roboto Mono" w:hAnsi="Roboto Mono"/>
+        </w:rPr>
+        <w:t>convert</w:t>
+      </w:r>
+      <w:r>
+        <w:rPr>
+          <w:rFonts w:ascii="Roboto Mono" w:hAnsi="Roboto Mono"/>
+        </w:rPr>
+        <w:t xml:space="preserve"> </w:t>
+      </w:r>
+      <w:r>
+        <w:rPr>
+          <w:rFonts w:ascii="Roboto Mono" w:hAnsi="Roboto Mono"/>
+        </w:rPr>
+        <w:t>one page or more or all pdf pages to images</w:t>
       </w:r>
     </w:p>
     <w:p>

</xml_diff>